<commit_message>
feat: back y front para poderes, correcciones en minutas compraventa y promesa
</commit_message>
<xml_diff>
--- a/backend/app/templates/minuta_promesa_compraventa.docx
+++ b/backend/app/templates/minuta_promesa_compraventa.docx
@@ -32,7 +32,7 @@
         <w:rPr>
           <w:b/>
         </w:rPr>
-        <w:t>PRIMERA.- COMPARECIENTES.- Comparecen a la celebración del presente contrato por una parte: {% for grupo in grupos_vendedores %}{% if grupo.es_empresa %}{% for p in grupo.personas %}{{ p.numero_numerico }}.- La compañía {{ p.razon_social }}, con RUC número {{ p.ruc_palabras }} ({{ p.ruc }}), debidamente representada por su {{ p.rep_cargo }}, {{ p.rep_articulo }} {{ p.rep_nombres_completos }}, de nacionalidad {{ p.rep_nacionalidad }}, con {{ p.rep_cedula_palabras }} ({{ p.rep_cedula }}), de {{ p.rep_edad }} años de edad, {{ p.rep_prof_ocup }}, con domicilio físico en {{ p.rep_direccion }}{% endfor %}{% else %}{% if grupo.tipo == 'conyuges' %}los cónyuges señores: {% endif %}{% for p in grupo.personas %}{{ p.numero_numerico }}.- {{ p.nombres_completos }}, de nacionalidad {{ p.nacionalidad }}, con cédula de ciudadanía número {{ p.cedula_palabras }} ({{ p.cedula }}), de {{ p.edad }} años de edad, de estado civil {{ p.estado_civil }}, de profesión {{ p.profesion }} y de ocupación {{ p.ocupacion }}, teléfono celular número {{ p.telefono_palabras }} ({{ p.telefono }}), con domicilio electrónico en el correo {{ p.email }}, por sus propios y personales derechos{% if not loop.last %}; y, {% endif %}{% endfor %}{% if grupo.tipo == 'conyuges' %}; ambos{% endif %} domiciliado{% if grupo.tipo == 'conyuges' %}s{% endif %} físicamente en {{ grupo.direccion }}{% endif %}{% if not loop.last %}; {% if grupos_vendedores[loop.index0].tipo == 'soltero' %}y, el señor: {% elif grupos_vendedores[loop.index0].es_empresa %}y, {% endif %}{% endif %}{% endfor %}, a quien se denominará la parte PROMITENTE VENDEDORA; y, por otra: {% for grupo in grupos_compradores %}{% if grupo.es_empresa %}{% for p in grupo.personas %}{{ p.numero_numerico }}.- La compañía {{ p.razon_social }}, con RUC número {{ p.ruc_palabras }} ({{ p.ruc }}), debidamente representada por su {{ p.rep_cargo }}, {{ p.rep_articulo }} {{ p.rep_nombres_completos }}, de nacionalidad {{ p.rep_nacionalidad }}, con {{ p.rep_cedula_palabras }} ({{ p.rep_cedula }}), de {{ p.rep_edad }} años de edad, {{ p.rep_prof_ocup }}, con domicilio físico en {{ p.rep_direccion }}{% endfor %}{% else %}{% if grupo.tipo == 'conyuges' %}los cónyuges señores: {% endif %}{% for p in grupo.personas %}{{ p.numero_numerico }}.- {{ p.nombres_completos }}, de nacionalidad {{ p.nacionalidad }}, con cédula de ciudadanía número {{ p.cedula_palabras }} ({{ p.cedula }}), de {{ p.edad }} años de edad, de estado civil {{ p.estado_civil }}, de profesión {{ p.profesion }} y de ocupación {{ p.ocupacion }}, teléfono celular número {{ p.telefono_palabras }} ({{ p.telefono }}), con domicilio electrónico en el correo {{ p.email }}, por sus propios y personales derechos{% if not loop.last %}; y, {% endif %}{% endfor %}{% if grupo.tipo == 'conyuges' %}; ambos{% endif %} domiciliado{% if grupo.tipo == 'conyuges' %}s{% endif %} físicamente en {{ grupo.direccion }}{% endif %}{% if not loop.last %}; {% if grupos_compradores[loop.index0].tipo == 'soltero' %}y, el señor: {% elif grupos_compradores[loop.index0].es_empresa %}y, {% endif %}{% endif %}{% endfor %}, a quien se denominará la parte PROMITENTE COMPRADORA.</w:t>
+        <w:t>PRIMERA.- COMPARECIENTES.- Comparecen a la celebración del presente contrato por una parte: {% for grupo in grupos_vendedores %}{% if grupo.es_empresa %}{% for p in grupo.personas %}{{ p.numero_numerico }}.- La compañía {{ p.razon_social }}, con RUC número {{ p.ruc_palabras }} ({{ p.ruc }}), debidamente representada por su {{ p.rep_cargo }}, {{ p.rep_articulo }} {{ p.rep_nombres_completos }}, de nacionalidad {{ p.rep_nacionalidad }}, con {{ p.rep_cedula_palabras }} ({{ p.rep_cedula }}), de {{ p.rep_edad }} años de edad, {{ p.rep_prof_ocup }}, con domicilio físico en {{ p.rep_direccion }}{% endfor %}{% else %}{% if grupo.tipo == 'conyuges' %}los cónyuges señores: {% endif %}{% for p in grupo.personas %}{{ p.numero_numerico }}.- {{ p.nombres_completos }}, de nacionalidad {{ p.nacionalidad }}, con cédula de ciudadanía número {{ p.cedula_palabras }} ({{ p.cedula }}), de {{ p.edad_palabras }} años de edad, de estado civil {{ p.estado_civil }}, de profesión {{ p.profesion }} y de ocupación {{ p.ocupacion }}, teléfono celular número {{ p.telefono_palabras }} ({{ p.telefono }}), con domicilio electrónico en el correo {{ p.email }}, por sus propios y personales derechos{% if not loop.last %}; y, {% endif %}{% endfor %}{% if grupo.tipo == 'conyuges' %}; ambos{% endif %} domiciliado{% if grupo.tipo == 'conyuges' %}s{% endif %} físicamente en {{ grupo.direccion }}{% endif %}{% if not loop.last %}; {% if grupos_vendedores[loop.index0].tipo == 'soltero' %}y, el señor: {% elif grupos_vendedores[loop.index0].es_empresa %}y, {% endif %}{% endif %}{% endfor %}, a quien se denominará la parte PROMITENTE VENDEDORA; y, por otra: {% for grupo in grupos_compradores %}{% if grupo.es_empresa %}{% for p in grupo.personas %}{{ p.numero_numerico }}.- La compañía {{ p.razon_social }}, con RUC número {{ p.ruc_palabras }} ({{ p.ruc }}), debidamente representada por su {{ p.rep_cargo }}, {{ p.rep_articulo }} {{ p.rep_nombres_completos }}, de nacionalidad {{ p.rep_nacionalidad }}, con {{ p.rep_cedula_palabras }} ({{ p.rep_cedula }}), de {{ p.rep_edad }} años de edad, {{ p.rep_prof_ocup }}, con domicilio físico en {{ p.rep_direccion }}{% endfor %}{% else %}{% if grupo.tipo == 'conyuges' %}los cónyuges señores: {% endif %}{% for p in grupo.personas %}{{ p.numero_numerico }}.- {{ p.nombres_completos }}, de nacionalidad {{ p.nacionalidad }}, con cédula de ciudadanía número {{ p.cedula_palabras }} ({{ p.cedula }}), de {{ p.edad_palabras }} años de edad, de estado civil {{ p.estado_civil }}, de profesión {{ p.profesion }} y de ocupación {{ p.ocupacion }}, teléfono celular número {{ p.telefono_palabras }} ({{ p.telefono }}), con domicilio electrónico en el correo {{ p.email }}, por sus propios y personales derechos{% if not loop.last %}; y, {% endif %}{% endfor %}{% if grupo.tipo == 'conyuges' %}; ambos{% endif %} domiciliado{% if grupo.tipo == 'conyuges' %}s{% endif %} físicamente en {{ grupo.direccion }}{% endif %}{% if not loop.last %}; {% if grupos_compradores[loop.index0].tipo == 'soltero' %}y, el señor: {% elif grupos_compradores[loop.index0].es_empresa %}y, {% endif %}{% endif %}{% endfor %}, a quien se denominará la parte PROMITENTE COMPRADORA.</w:t>
       </w:r>
     </w:p>
     <w:p>
@@ -55,7 +55,7 @@
       <w:r>
         <w:t>{% if es_horizontal %}</w:t>
         <w:br/>
-        <w:t>2.1.- La parte PROMITENTE VENDEDORA es propietaria de los siguientes inmuebles: {% for predio in predios %}{% if predio.es_compuesto %}{% for inmueble in predio.inmuebles %}{% if inmueble.tipo == 'Otro' %}{{ inmueble.tipo_otro }}{% else %}{{ inmueble.tipo }}{% endif %} {{ inmueble.numero_palabras }}, {% if inmueble.esta_construido %}nivel {{ inmueble.nivel }}, {% endif %}{% if inmueble.area_cubierta %}área cubierta {{ inmueble.area_cubierta_palabras }} metros cuadrados, {% endif %}{% if inmueble.area_descubierta %}área descubierta {{ inmueble.area_descubierta_palabras }} metros cuadrados, {% endif %}{% if inmueble.esta_construido %}Alícuota parcial {{ inmueble.alicuota_parcial_palabras }} por ciento; {% endif %}{% endfor %}{% if predio.inmuebles | selectattr('esta_construido') | list %}Alícuota total {{ predio.alicuota_total_palabras }} por ciento; {% endif %}{% else %}{% if predio.tipo == 'Otro' %}{{ predio.tipo_otro }}{% else %}{{ predio.tipo }}{% endif %} {{ predio.numero_palabras }}, {% if predio.inmuebles[0].esta_construido %}nivel {{ predio.inmuebles[0].nivel }}, {% endif %}{% if predio.inmuebles[0].area_cubierta %}área cubierta {{ predio.inmuebles[0].area_cubierta_palabras }} metros cuadrados, {% endif %}{% if predio.inmuebles[0].area_descubierta %}área descubierta {{ predio.inmuebles[0].area_descubierta_palabras }} metros cuadrados, {% endif %}{% if predio.inmuebles[0].esta_construido %}Alícuota parcial {{ predio.inmuebles[0].alicuota_parcial_palabras }} por ciento, Alícuota total {{ predio.alicuota_total_palabras }} por ciento; {% endif %}{% endif %}{% endfor %}del {{ nombre_conjunto }}, construido en el {{ ubicacion.lote }} número {{ ubicacion.numero_palabras }}, situado en la parroquia {{ ubicacion.parroquia }}, cantón {{ ubicacion.canton }}, Provincia de {{ ubicacion.provincia }}.</w:t>
+        <w:t>2.1.- La parte PROMITENTE VENDEDORA es propietaria de los siguientes inmuebles: {% for predio in predios %}{% if predio.es_compuesto %}{% for inmueble in predio.inmuebles %}{% if inmueble.tipo == 'Otro' %}{{ inmueble.tipo_otro }}{% else %}{{ inmueble.tipo }}{% endif %} {{ inmueble.numero_palabras }}, {% if inmueble.esta_construido %}nivel {{ inmueble.nivel }}, {% endif %}{% if inmueble.area_cubierta %}área cubierta {{ inmueble.area_cubierta_palabras }} metros cuadrados, {% endif %}{% if inmueble.area_descubierta %}área descubierta {{ inmueble.area_descubierta_palabras }} metros cuadrados, {% endif %}{% if inmueble.esta_construido %}Alícuota parcial {{ inmueble.alicuota_parcial_palabras }}; {% endif %}{% endfor %}{% if predio.inmuebles | selectattr('esta_construido') | list %}Alícuota total {{ predio.alicuota_total_palabras }}; {% endif %}{% else %}{% if predio.tipo == 'Otro' %}{{ predio.tipo_otro }}{% else %}{{ predio.tipo }}{% endif %} {{ predio.numero_palabras }}, {% if predio.inmuebles[0].esta_construido %}nivel {{ predio.inmuebles[0].nivel }}, {% endif %}{% if predio.inmuebles[0].area_cubierta %}área cubierta {{ predio.inmuebles[0].area_cubierta_palabras }} metros cuadrados, {% endif %}{% if predio.inmuebles[0].area_descubierta %}área descubierta {{ predio.inmuebles[0].area_descubierta_palabras }} metros cuadrados, {% endif %}{% if predio.inmuebles[0].esta_construido %}Alícuota parcial {{ predio.inmuebles[0].alicuota_parcial_palabras }} por ciento, Alícuota total {{ predio.alicuota_total_palabras }}; {% endif %}{% endif %}{% endfor %}del {{ nombre_conjunto }}, construido en el {{ ubicacion.lote }} número {{ ubicacion.numero_palabras }}, situado en la parroquia {{ ubicacion.parroquia }}, cantón {{ ubicacion.canton }}, Provincia de {{ ubicacion.provincia }}.</w:t>
         <w:br/>
         <w:t>{% else %}</w:t>
         <w:br/>

</xml_diff>